<commit_message>
Improve SD ABM coupling and app diagnostics
</commit_message>
<xml_diff>
--- a/results/EV_Supply_Chain_Model_Methods.docx
+++ b/results/EV_Supply_Chain_Model_Methods.docx
@@ -123,6 +123,25 @@
           <w:i w:val="0"/>
         </w:rPr>
         <w:t>The default configuration filters agents to the UK region for OEM and markets, while retaining all global mineral and cell agents. Mineral inflows to the SD layer are scaled by the UK market scope fraction (~2.4% of global demand) so that the SD stocks reflect UK-proportional exposure rather than global aggregates.</w:t>
+      </w:r>
+    </w:p>
+    <w:p/>
+    <w:p>
+      <w:r>
+        <w:rPr>
+          <w:b/>
+          <w:i w:val="0"/>
+        </w:rPr>
+        <w:t>Explicit SD-ABM communication</w:t>
+      </w:r>
+    </w:p>
+    <w:p>
+      <w:r>
+        <w:rPr>
+          <w:b w:val="0"/>
+          <w:i w:val="0"/>
+        </w:rPr>
+        <w:t>The two layers exchange a structured coupling packet each week. SD sends physical stock, measured stock, stockout risk, pipeline-arrival, price, demand, backlog, bullwhip, and policy signals to the agents. ABM agents return material flows plus diagnostic information on unmet cell demand, Tier-1 component shortfalls, OEM unmet demand, and the active bottleneck component. This makes the hybrid interface auditable and allows the SD price layer to respond to agent-level bottlenecks instead of only aggregate stock levels.</w:t>
       </w:r>
     </w:p>
     <w:p/>
@@ -573,7 +592,33 @@
         <w:pStyle w:val="Heading2"/>
       </w:pPr>
       <w:r>
-        <w:t>2.2 Feedback Loops (SD Layer)</w:t>
+        <w:t>2.2 SD-ABM Coupling Interface</w:t>
+      </w:r>
+    </w:p>
+    <w:p>
+      <w:r>
+        <w:rPr>
+          <w:b w:val="0"/>
+          <w:i w:val="0"/>
+        </w:rPr>
+        <w:t>The hybrid model now uses an explicit communication interface rather than relying only on agents reading individual SD attributes. At the start of each week, SDModel.compute_coupling_signals() refreshes the legacy input_fractions and also creates a coupling packet containing physical stocks, measured/perceived stocks, stockout-risk indicators, next pipeline arrivals, mineral and component prices, vehicle price signal, SD demand forecast, OEM backlog, bullwhip index, active policy state, and the previous week's ABM diagnostic summary.</w:t>
+      </w:r>
+    </w:p>
+    <w:p>
+      <w:r>
+        <w:rPr>
+          <w:b w:val="0"/>
+          <w:i w:val="0"/>
+        </w:rPr>
+        <w:t>After agents step, HybridModel._collect_flows() returns both material flows and diagnostic signals. The diagnostic signals include cell unmet demand, Tier-1 unmet component demand, OEM unmet demand, component-level shortfalls for packs/inverters/motors/harness, and a bottleneck component with severity in [0, 1]. The SD layer caches these diagnostics and feeds them into component and parts-price pressure, so a component bottleneck can affect downstream price signals even when aggregate stocks remain positive.</w:t>
+      </w:r>
+    </w:p>
+    <w:p>
+      <w:pPr>
+        <w:pStyle w:val="Heading2"/>
+      </w:pPr>
+      <w:r>
+        <w:t>2.3 Feedback Loops (SD Layer)</w:t>
       </w:r>
     </w:p>
     <w:p>
@@ -1931,7 +1976,7 @@
           <w:rFonts w:ascii="Courier New" w:hAnsi="Courier New"/>
           <w:sz w:val="17"/>
         </w:rPr>
-        <w:t xml:space="preserve">  // Step 2: SD -&gt; Agents (input availability signals)</w:t>
+        <w:t xml:space="preserve">  // Step 2: SD -&gt; Agents (explicit coupling signals)</w:t>
       </w:r>
     </w:p>
     <w:p>
@@ -1944,7 +1989,7 @@
           <w:rFonts w:ascii="Courier New" w:hAnsi="Courier New"/>
           <w:sz w:val="17"/>
         </w:rPr>
-        <w:t xml:space="preserve">  sd.compute_input_fractions()          // for each mineral/component:</w:t>
+        <w:t xml:space="preserve">  coupling &lt;- sd.compute_coupling_signals()</w:t>
       </w:r>
     </w:p>
     <w:p>
@@ -1957,7 +2002,46 @@
           <w:rFonts w:ascii="Courier New" w:hAnsi="Courier New"/>
           <w:sz w:val="17"/>
         </w:rPr>
-        <w:t xml:space="preserve">                                        //   fraction = f(stock, target, policy)</w:t>
+        <w:t xml:space="preserve">  // coupling contains:</w:t>
+      </w:r>
+    </w:p>
+    <w:p>
+      <w:pPr>
+        <w:spacing w:after="0" w:before="0"/>
+        <w:ind w:left="567"/>
+      </w:pPr>
+      <w:r>
+        <w:rPr>
+          <w:rFonts w:ascii="Courier New" w:hAnsi="Courier New"/>
+          <w:sz w:val="17"/>
+        </w:rPr>
+        <w:t xml:space="preserve">  //   input_fractions, physical_stocks, measured_stocks, stockout_risk,</w:t>
+      </w:r>
+    </w:p>
+    <w:p>
+      <w:pPr>
+        <w:spacing w:after="0" w:before="0"/>
+        <w:ind w:left="567"/>
+      </w:pPr>
+      <w:r>
+        <w:rPr>
+          <w:rFonts w:ascii="Courier New" w:hAnsi="Courier New"/>
+          <w:sz w:val="17"/>
+        </w:rPr>
+        <w:t xml:space="preserve">  //   pipeline_arrivals_next, mineral_prices, component_prices,</w:t>
+      </w:r>
+    </w:p>
+    <w:p>
+      <w:pPr>
+        <w:spacing w:after="0" w:before="0"/>
+        <w:ind w:left="567"/>
+      </w:pPr>
+      <w:r>
+        <w:rPr>
+          <w:rFonts w:ascii="Courier New" w:hAnsi="Courier New"/>
+          <w:sz w:val="17"/>
+        </w:rPr>
+        <w:t xml:space="preserve">  //   vehicle_price_signal, demand_forecast, backlog, bullwhip, policy</w:t>
       </w:r>
     </w:p>
     <w:p>
@@ -2438,7 +2522,7 @@
           <w:rFonts w:ascii="Courier New" w:hAnsi="Courier New"/>
           <w:sz w:val="17"/>
         </w:rPr>
-        <w:t xml:space="preserve">  // Step 8: Collect ABM flows -&gt; feed to SD</w:t>
+        <w:t xml:space="preserve">  // Step 8: Collect ABM flows and diagnostics -&gt; feed to SD</w:t>
       </w:r>
     </w:p>
     <w:p>
@@ -2529,6 +2613,58 @@
           <w:rFonts w:ascii="Courier New" w:hAnsi="Courier New"/>
           <w:sz w:val="17"/>
         </w:rPr>
+        <w:t xml:space="preserve">  // diagnostics:</w:t>
+      </w:r>
+    </w:p>
+    <w:p>
+      <w:pPr>
+        <w:spacing w:after="0" w:before="0"/>
+        <w:ind w:left="567"/>
+      </w:pPr>
+      <w:r>
+        <w:rPr>
+          <w:rFonts w:ascii="Courier New" w:hAnsi="Courier New"/>
+          <w:sz w:val="17"/>
+        </w:rPr>
+        <w:t xml:space="preserve">  //   shortfall_{packs|inverters|motors|harness}_k</w:t>
+      </w:r>
+    </w:p>
+    <w:p>
+      <w:pPr>
+        <w:spacing w:after="0" w:before="0"/>
+        <w:ind w:left="567"/>
+      </w:pPr>
+      <w:r>
+        <w:rPr>
+          <w:rFonts w:ascii="Courier New" w:hAnsi="Courier New"/>
+          <w:sz w:val="17"/>
+        </w:rPr>
+        <w:t xml:space="preserve">  //   cell_unmet_demand_gwh, tier1_unmet_demand_k, oem_unmet_demand_k</w:t>
+      </w:r>
+    </w:p>
+    <w:p>
+      <w:pPr>
+        <w:spacing w:after="0" w:before="0"/>
+        <w:ind w:left="567"/>
+      </w:pPr>
+      <w:r>
+        <w:rPr>
+          <w:rFonts w:ascii="Courier New" w:hAnsi="Courier New"/>
+          <w:sz w:val="17"/>
+        </w:rPr>
+        <w:t xml:space="preserve">  //   bottleneck_component, bottleneck_severity</w:t>
+      </w:r>
+    </w:p>
+    <w:p>
+      <w:pPr>
+        <w:spacing w:after="0" w:before="0"/>
+        <w:ind w:left="567"/>
+      </w:pPr>
+      <w:r>
+        <w:rPr>
+          <w:rFonts w:ascii="Courier New" w:hAnsi="Courier New"/>
+          <w:sz w:val="17"/>
+        </w:rPr>
         <w:t xml:space="preserve"> </w:t>
       </w:r>
     </w:p>
@@ -2607,7 +2743,7 @@
           <w:rFonts w:ascii="Courier New" w:hAnsi="Courier New"/>
           <w:sz w:val="17"/>
         </w:rPr>
-        <w:t xml:space="preserve">  //  9d. Cap stocks at 4 * target (policy-adjusted)</w:t>
+        <w:t xml:space="preserve">  //  9d. Cache ABM diagnostics for bottleneck-aware price pressure</w:t>
       </w:r>
     </w:p>
     <w:p>
@@ -2620,7 +2756,7 @@
           <w:rFonts w:ascii="Courier New" w:hAnsi="Courier New"/>
           <w:sz w:val="17"/>
         </w:rPr>
-        <w:t xml:space="preserve">  //  9e. Measurement lag: measured_stock += (1/tau) * (stock - measured_stock)</w:t>
+        <w:t xml:space="preserve">  //  9e. Cap stocks at 4 * target (policy-adjusted)</w:t>
       </w:r>
     </w:p>
     <w:p>
@@ -2633,7 +2769,20 @@
           <w:rFonts w:ascii="Courier New" w:hAnsi="Courier New"/>
           <w:sz w:val="17"/>
         </w:rPr>
-        <w:t xml:space="preserve">  //  9f. F1 Price formation (softplus scarcity signal):</w:t>
+        <w:t xml:space="preserve">  //  9f. Measurement lag: measured_stock += (1/tau) * (stock - measured_stock)</w:t>
+      </w:r>
+    </w:p>
+    <w:p>
+      <w:pPr>
+        <w:spacing w:after="0" w:before="0"/>
+        <w:ind w:left="567"/>
+      </w:pPr>
+      <w:r>
+        <w:rPr>
+          <w:rFonts w:ascii="Courier New" w:hAnsi="Courier New"/>
+          <w:sz w:val="17"/>
+        </w:rPr>
+        <w:t xml:space="preserve">  //  9g. F1 Price formation (softplus scarcity signal):</w:t>
       </w:r>
     </w:p>
     <w:p>
@@ -2685,7 +2834,7 @@
           <w:rFonts w:ascii="Courier New" w:hAnsi="Courier New"/>
           <w:sz w:val="17"/>
         </w:rPr>
-        <w:t xml:space="preserve">  //  9g. F2 Chemistry mix (LFP share):</w:t>
+        <w:t xml:space="preserve">  //  9h. F2 Chemistry mix (LFP share):</w:t>
       </w:r>
     </w:p>
     <w:p>
@@ -2724,7 +2873,7 @@
           <w:rFonts w:ascii="Courier New" w:hAnsi="Courier New"/>
           <w:sz w:val="17"/>
         </w:rPr>
-        <w:t xml:space="preserve">  //  9h. F3 Price signal (composite battery price):</w:t>
+        <w:t xml:space="preserve">  //  9i. F3 Price signal (composite battery/component price):</w:t>
       </w:r>
     </w:p>
     <w:p>
@@ -2737,7 +2886,7 @@
           <w:rFonts w:ascii="Courier New" w:hAnsi="Courier New"/>
           <w:sz w:val="17"/>
         </w:rPr>
-        <w:t xml:space="preserve">  //       price_signal = weighted_mean(mineral_prices, bom_weights) * component_price_factor</w:t>
+        <w:t xml:space="preserve">  //       price_signal = weighted_mean(mineral_prices, bom_weights)</w:t>
       </w:r>
     </w:p>
     <w:p>
@@ -2750,7 +2899,20 @@
           <w:rFonts w:ascii="Courier New" w:hAnsi="Courier New"/>
           <w:sz w:val="17"/>
         </w:rPr>
-        <w:t xml:space="preserve">  //  9i. F4 Cell capacity investment (Erlang pipeline):</w:t>
+        <w:t xml:space="preserve">  //       component prices add stock scarcity + ABM component shortfall pressure</w:t>
+      </w:r>
+    </w:p>
+    <w:p>
+      <w:pPr>
+        <w:spacing w:after="0" w:before="0"/>
+        <w:ind w:left="567"/>
+      </w:pPr>
+      <w:r>
+        <w:rPr>
+          <w:rFonts w:ascii="Courier New" w:hAnsi="Courier New"/>
+          <w:sz w:val="17"/>
+        </w:rPr>
+        <w:t xml:space="preserve">  //  9j. F4 Cell capacity investment (Erlang pipeline):</w:t>
       </w:r>
     </w:p>
     <w:p>
@@ -2802,7 +2964,7 @@
           <w:rFonts w:ascii="Courier New" w:hAnsi="Courier New"/>
           <w:sz w:val="17"/>
         </w:rPr>
-        <w:t xml:space="preserve">  //  9j. F5 Demand/backlog (SD reconciliation):</w:t>
+        <w:t xml:space="preserve">  //  9k. F5 Demand/backlog (SD reconciliation):</w:t>
       </w:r>
     </w:p>
     <w:p>
@@ -2854,7 +3016,7 @@
           <w:rFonts w:ascii="Courier New" w:hAnsi="Courier New"/>
           <w:sz w:val="17"/>
         </w:rPr>
-        <w:t xml:space="preserve">  //  9k. Bullwhip: bullwhip_index = EWMA(order_rate / 4*vehicle_demand, smooth * mult)</w:t>
+        <w:t xml:space="preserve">  //  9l. Bullwhip: bullwhip_index = EWMA(order_rate / 4*vehicle_demand, smooth * mult)</w:t>
       </w:r>
     </w:p>
     <w:p>
@@ -3274,7 +3436,7 @@
           <w:b/>
           <w:i w:val="0"/>
         </w:rPr>
-        <w:t>Layer 3: ABM and Hybrid Tests (test_abm.py, 84 checks)</w:t>
+        <w:t>Layer 3: ABM and Hybrid Tests (test_abm.py, 87 checks)</w:t>
       </w:r>
     </w:p>
     <w:p>
@@ -3283,7 +3445,7 @@
           <w:b w:val="0"/>
           <w:i w:val="0"/>
         </w:rPr>
-        <w:t>Tests all five agent classes in isolation using a FakeModel stub, and the full hybrid model across 15 test groups: construction, 52-week baseline run, reproducibility, individual agent behaviour, shock propagation cascade, all 10 scenario library scenarios, policy parameter modifications, DataFrame schema, archetype differences, ABM-SD coupling consistency, and shock mitigation.</w:t>
+        <w:t>Tests all five agent classes in isolation using a FakeModel stub, and the full hybrid model across 15 test groups: construction, 52-week baseline run, reproducibility, individual agent behaviour, shock propagation cascade, all 10 scenario library scenarios, policy parameter modifications, DataFrame schema, archetype differences, ABM-SD coupling consistency, explicit coupling-bus diagnostics, and shock mitigation.</w:t>
       </w:r>
     </w:p>
     <w:p/>
@@ -3293,7 +3455,7 @@
           <w:b/>
           <w:i w:val="0"/>
         </w:rPr>
-        <w:t>Layer 4: Full Model Validation (validate_model.py, 476 checks)</w:t>
+        <w:t>Layer 4: Full Model Validation (validate_model.py, 478 checks)</w:t>
       </w:r>
     </w:p>
     <w:p>
@@ -3302,7 +3464,7 @@
           <w:b w:val="0"/>
           <w:i w:val="0"/>
         </w:rPr>
-        <w:t>Runs all 34 scenarios for 260 weeks and checks: static configuration integrity, numeric invariants, calibration targets, shock propagation chain at each tier, policy effectiveness (mean OEM production uplift, recovery acceleration, mineral stock injection), demand and capacity dynamics (growth rate, LFP bounds, bullwhip &gt; 1), SD–ABM consistency (stocks near target, no stockouts, OEM production grows), and real historical time-series MAE against ONS/SMMT UK production index.</w:t>
+        <w:t>Runs all 34 scenarios for 260 weeks and checks: static configuration integrity, numeric invariants, calibration targets, shock propagation chain at each tier, policy effectiveness (mean OEM production uplift, recovery acceleration, mineral stock injection), demand and capacity dynamics (growth rate, LFP bounds, bullwhip &gt; 1), SD–ABM consistency (stocks near target, no stockouts, OEM production grows, diagnostic coupling columns present and bounded), and real historical time-series MAE against ONS/SMMT UK production index.</w:t>
       </w:r>
     </w:p>
     <w:p/>

</xml_diff>